<commit_message>
Refine project scope and submission details
</commit_message>
<xml_diff>
--- a/docs/smart-box-iot-gca1-design.docx
+++ b/docs/smart-box-iot-gca1-design.docx
@@ -333,6 +333,21 @@
             <w:r>
               <w:t>: Universal Design Project</w:t>
             </w:r>
+            <w:r>
+              <w:t xml:space="preserve">, </w:t>
+            </w:r>
+            <w:r>
+              <w:rPr>
+                <w:sz w:val="16"/>
+              </w:rPr>
+              <w:t xml:space="preserve"> </w:t>
+            </w:r>
+            <w:r>
+              <w:rPr>
+                <w:sz w:val="16"/>
+              </w:rPr>
+              <w:t>IoT</w:t>
+            </w:r>
           </w:p>
         </w:tc>
         <w:tc>
@@ -739,7 +754,7 @@
                 </mc:Choice>
                 <mc:Fallback>
                   <w:pict>
-                    <v:shapetype w14:anchorId="12BBAE08" id="_x0000_t75" coordsize="21600,21600" o:spt="75" o:preferrelative="t" path="m@4@5l@4@11@9@11@9@5xe" filled="f" stroked="f">
+                    <v:shapetype w14:anchorId="25888492" id="_x0000_t75" coordsize="21600,21600" o:spt="75" o:preferrelative="t" path="m@4@5l@4@11@9@11@9@5xe" filled="f" stroked="f">
                       <v:stroke joinstyle="miter"/>
                       <v:formulas>
                         <v:f eqn="if lineDrawn pixelLineWidth 0"/>
@@ -1188,7 +1203,7 @@
       <w:pPr>
         <w:pStyle w:val="Title"/>
         <w:rPr>
-          <w:lang w:val="ru-RU"/>
+          <w:lang w:val="en-IE"/>
         </w:rPr>
       </w:pPr>
     </w:p>
@@ -1217,7 +1232,7 @@
     <w:p>
       <w:pPr>
         <w:rPr>
-          <w:lang w:val="ru-RU"/>
+          <w:lang w:val="en-IE"/>
         </w:rPr>
       </w:pPr>
       <w:r>
@@ -1545,8 +1560,13 @@
       </w:r>
     </w:p>
     <w:p>
-      <w:r>
-        <w:t>Use a compatible 5 V / 3 A USB-C supply for the Pi 400. Keep the controller outside the monitored box and route the sensor cable through a protected opening to reduce controller heat effects. This mains arrangement does not provide portable operation. A future portable hardware revision must select a regulated power bank capable of the controller's load, measure runtime and decide between a phone hotspot and a separately researched cellular modem. No GSM module is required for the bench scope; uninterrupted mobile connectivity is not claimed.</w:t>
+      <w:pPr>
+        <w:rPr>
+          <w:lang w:val="en-IE"/>
+        </w:rPr>
+      </w:pPr>
+      <w:r>
+        <w:t>The Raspberry Pi 400 will be powered using a compatible 5 V / 3 A USB-C mains power supply. For the G-CA1 bench prototype, the Raspberry Pi will remain outside the monitored box, with the SCD-41 sensor positioned inside the box and connected through a protected cable opening. This helps reduce the effect of heat generated by the Raspberry Pi on the temperature measurement. The Raspberry Pi will connect to the internet using Wi-Fi. As the current prototype is mains-powered and is not designed for standalone mobile operation, a power bank and GSM module are not required. Portable power and mobile connectivity may be considered as future work.</w:t>
       </w:r>
     </w:p>
     <w:p>
@@ -1624,11 +1644,8 @@
         </w:rPr>
       </w:pPr>
       <w:r>
-        <w:t xml:space="preserve">A cloud virtual machine hosts Mosquitto, an ingestion worker, FastAPI and MySQL for the prototype. Hosting provider, region, domain and account ownership require team selection; no deployment is claimed. MySQL listens only on the </w:t>
-      </w:r>
-      <w:r>
         <w:lastRenderedPageBreak/>
-        <w:t>private/local interface. Restrict public access to HTTPS and authenticated MQTT/TLS; administration uses restricted SSH access.</w:t>
+        <w:t>A cloud virtual machine hosts Mosquitto, an ingestion worker, FastAPI and MySQL for the prototype. Hosting provider, region, domain and account ownership require team selection; no deployment is claimed. MySQL listens only on the private/local interface. Restrict public access to HTTPS and authenticated MQTT/TLS; administration uses restricted SSH access.</w:t>
       </w:r>
     </w:p>
     <w:tbl>
@@ -2179,6 +2196,7 @@
     </w:p>
     <w:p>
       <w:r>
+        <w:lastRenderedPageBreak/>
         <w:t xml:space="preserve">The database research supplies relational tables, foreign keys and parameterised queries; schema.sql extracts that proposed schema for review. </w:t>
       </w:r>
       <w:r>
@@ -2199,11 +2217,7 @@
         <w:t>password_hash</w:t>
       </w:r>
       <w:r>
-        <w:t xml:space="preserve"> stores the Argon2id hash for the proposed local-account design. This is a core schema proposal, not a tested migration. Session storage, device </w:t>
-      </w:r>
-      <w:r>
-        <w:lastRenderedPageBreak/>
-        <w:t xml:space="preserve">certificate registration, notification subscriptions/outbox and job-run records require additional tables during implementation. Boxes link to users through </w:t>
+        <w:t xml:space="preserve"> stores the Argon2id hash for the proposed local-account design. This is a core schema proposal, not a tested migration. Session storage, device certificate registration, notification subscriptions/outbox and job-run records require additional tables during implementation. Boxes link to users through </w:t>
       </w:r>
       <w:r>
         <w:rPr>
@@ -5088,7 +5102,19 @@
     </w:p>
     <w:p>
       <w:r>
-        <w:t>The device records temperature inside a portable medication box. MySQL is the proposed central database; SQLite provides a durable offline queue on the Raspberry Pi.</w:t>
+        <w:t xml:space="preserve">The device records temperature inside </w:t>
+      </w:r>
+      <w:r>
+        <w:t xml:space="preserve">Controlled Drug </w:t>
+      </w:r>
+      <w:r>
+        <w:rPr>
+          <w:lang w:val="en-IE"/>
+        </w:rPr>
+        <w:t>B</w:t>
+      </w:r>
+      <w:r>
+        <w:t>ox. MySQL is the proposed central database; SQLite provides a durable offline queue on the Raspberry Pi.</w:t>
       </w:r>
     </w:p>
     <w:p>
@@ -11273,6 +11299,54 @@
     <w:p>
       <w:r>
         <w:rPr>
+          <w:noProof/>
+        </w:rPr>
+        <w:drawing>
+          <wp:anchor distT="0" distB="0" distL="114300" distR="114300" simplePos="0" relativeHeight="251657216" behindDoc="0" locked="0" layoutInCell="1" allowOverlap="1" wp14:anchorId="50EBAC4B" wp14:editId="1FF9DCF2">
+            <wp:simplePos x="0" y="0"/>
+            <wp:positionH relativeFrom="column">
+              <wp:posOffset>4425287</wp:posOffset>
+            </wp:positionH>
+            <wp:positionV relativeFrom="paragraph">
+              <wp:posOffset>211400</wp:posOffset>
+            </wp:positionV>
+            <wp:extent cx="1979295" cy="1979295"/>
+            <wp:effectExtent l="0" t="0" r="1905" b="1905"/>
+            <wp:wrapSquare wrapText="bothSides"/>
+            <wp:docPr id="1464692014" name="Picture 1"/>
+            <wp:cNvGraphicFramePr>
+              <a:graphicFrameLocks xmlns:a="http://schemas.openxmlformats.org/drawingml/2006/main" noChangeAspect="1"/>
+            </wp:cNvGraphicFramePr>
+            <a:graphic xmlns:a="http://schemas.openxmlformats.org/drawingml/2006/main">
+              <a:graphicData uri="http://schemas.openxmlformats.org/drawingml/2006/picture">
+                <pic:pic xmlns:pic="http://schemas.openxmlformats.org/drawingml/2006/picture">
+                  <pic:nvPicPr>
+                    <pic:cNvPr id="1464692014" name="Picture 1464692014"/>
+                    <pic:cNvPicPr/>
+                  </pic:nvPicPr>
+                  <pic:blipFill>
+                    <a:blip r:embed="rId42"/>
+                    <a:stretch>
+                      <a:fillRect/>
+                    </a:stretch>
+                  </pic:blipFill>
+                  <pic:spPr>
+                    <a:xfrm>
+                      <a:off x="0" y="0"/>
+                      <a:ext cx="1979295" cy="1979295"/>
+                    </a:xfrm>
+                    <a:prstGeom prst="rect">
+                      <a:avLst/>
+                    </a:prstGeom>
+                  </pic:spPr>
+                </pic:pic>
+              </a:graphicData>
+            </a:graphic>
+          </wp:anchor>
+        </w:drawing>
+      </w:r>
+      <w:r>
+        <w:rPr>
           <w:b/>
         </w:rPr>
         <w:t>Name:</w:t>
@@ -11521,6 +11595,7 @@
         <w:pStyle w:val="ListBullet"/>
       </w:pPr>
       <w:r>
+        <w:lastRenderedPageBreak/>
         <w:t>can add an audible warning if the Should Have buzzer is implemented;</w:t>
       </w:r>
     </w:p>
@@ -11529,7 +11604,6 @@
         <w:pStyle w:val="ListBullet"/>
       </w:pPr>
       <w:r>
-        <w:lastRenderedPageBreak/>
         <w:t>sends a phone notification when the temperature approaches or exceeds the configured limit;</w:t>
       </w:r>
     </w:p>
@@ -11753,6 +11827,7 @@
     </w:p>
     <w:p>
       <w:r>
+        <w:lastRenderedPageBreak/>
         <w:t xml:space="preserve">&gt; </w:t>
       </w:r>
       <w:r>
@@ -11764,7 +11839,6 @@
     </w:p>
     <w:p>
       <w:r>
-        <w:lastRenderedPageBreak/>
         <w:t>The baseline records individual observations for later review. Estimated summaries must break at gaps and invalid samples; they do not prove continuous exposure.</w:t>
       </w:r>
     </w:p>
@@ -12215,7 +12289,7 @@
     </w:p>
     <w:p>
       <w:r>
-        <w:t>&gt; TempSafe is an automatic IoT monitoring system for a Controlled Drug Box that tracks temperature over time and gives clear visual, audible and phone-notification feedback when storage conditions require attention.</w:t>
+        <w:t>TempSafe is an automatic IoT monitoring system for a Controlled Drug Box that tracks temperature over time and gives clear visual, audible and phone-notification feedback when storage conditions require attention.</w:t>
       </w:r>
     </w:p>
     <w:p>
@@ -12444,7 +12518,7 @@
               <w:rPr>
                 <w:sz w:val="16"/>
               </w:rPr>
-              <w:t>Portable medication box used in an emergency-service context; initial demonstration on a bench with no medicines; intermittent Wi-Fi/hotspot connectivity</w:t>
+              <w:t>Controlled Drug Box located inside a Vehicle Security Safe in an ambulance; the initial prototype is demonstrated on a bench with no medicines and uses Wi-Fi connectivity.</w:t>
             </w:r>
           </w:p>
         </w:tc>
@@ -13387,7 +13461,7 @@
               <w:rPr>
                 <w:sz w:val="16"/>
               </w:rPr>
-              <w:t>Should</w:t>
+              <w:t>Must</w:t>
             </w:r>
           </w:p>
         </w:tc>
@@ -13403,7 +13477,7 @@
               <w:rPr>
                 <w:sz w:val="16"/>
               </w:rPr>
-              <w:t>Group consecutive low/high observations using observation order; label duration as estimated; missing/invalid samples break continuity; delayed data causes affected history to be recalculated</w:t>
+              <w:t>Group consecutive out-of-range observations using observation time and provide an estimated excursion duration. Missing or invalid samples break continuity; delayed data causes affected history to be recalculated.</w:t>
             </w:r>
           </w:p>
         </w:tc>
@@ -16299,7 +16373,6 @@
               <w:rPr>
                 <w:sz w:val="16"/>
               </w:rPr>
-              <w:lastRenderedPageBreak/>
               <w:t>TP-16 / FR-09, FR-10</w:t>
             </w:r>
           </w:p>
@@ -18993,7 +19066,7 @@
               <w:rPr>
                 <w:sz w:val="16"/>
               </w:rPr>
-              <w:t>Existing DOCX contains names/numbers and embedded images, but says Universal Design Project and 09/10/26. Verify whether this joint-assessment sheet is accepted for IoT; otherwise complete the official IoT sheet. Existing signatures must not be repurposed as approval of a different declaration.</w:t>
+              <w:t>Completed IoT CA cover sheet included with the submission.</w:t>
             </w:r>
           </w:p>
         </w:tc>
@@ -19167,7 +19240,6 @@
               <w:rPr>
                 <w:sz w:val="16"/>
               </w:rPr>
-              <w:lastRenderedPageBreak/>
               <w:t>Moodle</w:t>
             </w:r>
           </w:p>
@@ -19287,17 +19359,6 @@
               </w:rPr>
               <w:t>5eeffd5: consolidated design</w:t>
             </w:r>
-            <w:hyperlink r:id="rId42">
-              <w:r>
-                <w:t>[source]</w:t>
-              </w:r>
-            </w:hyperlink>
-            <w:r>
-              <w:rPr>
-                <w:sz w:val="16"/>
-              </w:rPr>
-              <w:t>, 9437bd9: SQL schema</w:t>
-            </w:r>
             <w:hyperlink r:id="rId43">
               <w:r>
                 <w:t>[source]</w:t>
@@ -19307,41 +19368,7 @@
               <w:rPr>
                 <w:sz w:val="16"/>
               </w:rPr>
-              <w:t>.</w:t>
-            </w:r>
-          </w:p>
-        </w:tc>
-      </w:tr>
-      <w:tr>
-        <w:tc>
-          <w:tcPr>
-            <w:tcW w:w="2660" w:type="dxa"/>
-          </w:tcPr>
-          <w:p>
-            <w:pPr>
-              <w:spacing w:after="60"/>
-            </w:pPr>
-            <w:r>
-              <w:rPr>
-                <w:sz w:val="16"/>
-              </w:rPr>
-              <w:t>Hanna Bokariuk / HannaBProjects</w:t>
-            </w:r>
-          </w:p>
-        </w:tc>
-        <w:tc>
-          <w:tcPr>
-            <w:tcW w:w="7432" w:type="dxa"/>
-          </w:tcPr>
-          <w:p>
-            <w:pPr>
-              <w:spacing w:after="60"/>
-            </w:pPr>
-            <w:r>
-              <w:rPr>
-                <w:sz w:val="16"/>
-              </w:rPr>
-              <w:t>ec2eedb: scope</w:t>
+              <w:t>, 9437bd9: SQL schema</w:t>
             </w:r>
             <w:hyperlink r:id="rId44">
               <w:r>
@@ -19352,7 +19379,41 @@
               <w:rPr>
                 <w:sz w:val="16"/>
               </w:rPr>
-              <w:t>, cd72000: hardware list</w:t>
+              <w:t>.</w:t>
+            </w:r>
+          </w:p>
+        </w:tc>
+      </w:tr>
+      <w:tr>
+        <w:tc>
+          <w:tcPr>
+            <w:tcW w:w="2660" w:type="dxa"/>
+          </w:tcPr>
+          <w:p>
+            <w:pPr>
+              <w:spacing w:after="60"/>
+            </w:pPr>
+            <w:r>
+              <w:rPr>
+                <w:sz w:val="16"/>
+              </w:rPr>
+              <w:t>Hanna Bokariuk / HannaBProjects</w:t>
+            </w:r>
+          </w:p>
+        </w:tc>
+        <w:tc>
+          <w:tcPr>
+            <w:tcW w:w="7432" w:type="dxa"/>
+          </w:tcPr>
+          <w:p>
+            <w:pPr>
+              <w:spacing w:after="60"/>
+            </w:pPr>
+            <w:r>
+              <w:rPr>
+                <w:sz w:val="16"/>
+              </w:rPr>
+              <w:t>ec2eedb: scope</w:t>
             </w:r>
             <w:hyperlink r:id="rId45">
               <w:r>
@@ -19363,7 +19424,7 @@
               <w:rPr>
                 <w:sz w:val="16"/>
               </w:rPr>
-              <w:t>, 5f99ef0: cover sheet</w:t>
+              <w:t>, cd72000: hardware list</w:t>
             </w:r>
             <w:hyperlink r:id="rId46">
               <w:r>
@@ -19374,41 +19435,7 @@
               <w:rPr>
                 <w:sz w:val="16"/>
               </w:rPr>
-              <w:t>.</w:t>
-            </w:r>
-          </w:p>
-        </w:tc>
-      </w:tr>
-      <w:tr>
-        <w:tc>
-          <w:tcPr>
-            <w:tcW w:w="2660" w:type="dxa"/>
-          </w:tcPr>
-          <w:p>
-            <w:pPr>
-              <w:spacing w:after="60"/>
-            </w:pPr>
-            <w:r>
-              <w:rPr>
-                <w:sz w:val="16"/>
-              </w:rPr>
-              <w:t>Maryna Hordiienko</w:t>
-            </w:r>
-          </w:p>
-        </w:tc>
-        <w:tc>
-          <w:tcPr>
-            <w:tcW w:w="7432" w:type="dxa"/>
-          </w:tcPr>
-          <w:p>
-            <w:pPr>
-              <w:spacing w:after="60"/>
-            </w:pPr>
-            <w:r>
-              <w:rPr>
-                <w:sz w:val="16"/>
-              </w:rPr>
-              <w:t>33468f6: dashboard/website research</w:t>
+              <w:t>, 5f99ef0: cover sheet</w:t>
             </w:r>
             <w:hyperlink r:id="rId47">
               <w:r>
@@ -19419,7 +19446,41 @@
               <w:rPr>
                 <w:sz w:val="16"/>
               </w:rPr>
-              <w:t>, a661dae: design principles</w:t>
+              <w:t>.</w:t>
+            </w:r>
+          </w:p>
+        </w:tc>
+      </w:tr>
+      <w:tr>
+        <w:tc>
+          <w:tcPr>
+            <w:tcW w:w="2660" w:type="dxa"/>
+          </w:tcPr>
+          <w:p>
+            <w:pPr>
+              <w:spacing w:after="60"/>
+            </w:pPr>
+            <w:r>
+              <w:rPr>
+                <w:sz w:val="16"/>
+              </w:rPr>
+              <w:t>Maryna Hordiienko</w:t>
+            </w:r>
+          </w:p>
+        </w:tc>
+        <w:tc>
+          <w:tcPr>
+            <w:tcW w:w="7432" w:type="dxa"/>
+          </w:tcPr>
+          <w:p>
+            <w:pPr>
+              <w:spacing w:after="60"/>
+            </w:pPr>
+            <w:r>
+              <w:rPr>
+                <w:sz w:val="16"/>
+              </w:rPr>
+              <w:t>33468f6: dashboard/website research</w:t>
             </w:r>
             <w:hyperlink r:id="rId48">
               <w:r>
@@ -19430,6 +19491,17 @@
               <w:rPr>
                 <w:sz w:val="16"/>
               </w:rPr>
+              <w:t>, a661dae: design principles</w:t>
+            </w:r>
+            <w:hyperlink r:id="rId49">
+              <w:r>
+                <w:t>[source]</w:t>
+              </w:r>
+            </w:hyperlink>
+            <w:r>
+              <w:rPr>
+                <w:sz w:val="16"/>
+              </w:rPr>
               <w:t>.</w:t>
             </w:r>
           </w:p>
@@ -19443,7 +19515,7 @@
     </w:p>
     <w:p/>
     <w:sectPr>
-      <w:footerReference w:type="default" r:id="rId49"/>
+      <w:footerReference w:type="default" r:id="rId50"/>
       <w:pgSz w:w="11906" w:h="16838"/>
       <w:pgMar w:top="907" w:right="907" w:bottom="907" w:left="907" w:header="720" w:footer="720" w:gutter="0"/>
       <w:cols w:space="720"/>
@@ -20480,7 +20552,6 @@
   <w:style w:type="character" w:default="1" w:styleId="DefaultParagraphFont">
     <w:name w:val="Default Paragraph Font"/>
     <w:uiPriority w:val="1"/>
-    <w:semiHidden/>
     <w:unhideWhenUsed/>
   </w:style>
   <w:style w:type="table" w:default="1" w:styleId="TableNormal">

</xml_diff>